<commit_message>
Menu: one-word labels (Shop, Quiz, Reviews, Learn, About); FAQ to footer, blog under Learn
Co-Authored-By: Claude Opus 5.5 <noreply@anthropic.com>
Claude-Session: https://claude.ai/code/session_01Ge5rEocBSg6juxs1ntKF6j
</commit_message>
<xml_diff>
--- a/website/copy/Cocoon-Website-Copy-draft1.docx
+++ b/website/copy/Cocoon-Website-Copy-draft1.docx
@@ -1411,7 +1411,7 @@
           <w:bCs/>
           <w:b/>
         </w:rPr>
-        <w:t xml:space="preserve">Find Your Formula</w:t>
+        <w:t xml:space="preserve">Quiz</w:t>
       </w:r>
       <w:r>
         <w:t xml:space="preserve"> </w:t>
@@ -1428,6 +1428,12 @@
         </w:rPr>
         <w:t xml:space="preserve">/pages/quiz</w:t>
       </w:r>
+      <w:r>
+        <w:t xml:space="preserve"> </w:t>
+      </w:r>
+      <w:r>
+        <w:t xml:space="preserve">(the page itself and its buttons say "Find your formula")</w:t>
+      </w:r>
     </w:p>
     <w:p>
       <w:pPr>
@@ -1442,7 +1448,7 @@
           <w:bCs/>
           <w:b/>
         </w:rPr>
-        <w:t xml:space="preserve">Results</w:t>
+        <w:t xml:space="preserve">Reviews</w:t>
       </w:r>
       <w:r>
         <w:t xml:space="preserve"> </w:t>
@@ -1479,7 +1485,7 @@
         <w:t xml:space="preserve"> </w:t>
       </w:r>
       <w:r>
-        <w:t xml:space="preserve">→</w:t>
+        <w:t xml:space="preserve">▾: How Hormonal Acne Works →</w:t>
       </w:r>
       <w:r>
         <w:t xml:space="preserve"> </w:t>
@@ -1489,6 +1495,21 @@
           <w:rStyle w:val="VerbatimChar"/>
         </w:rPr>
         <w:t xml:space="preserve">/pages/learn</w:t>
+      </w:r>
+      <w:r>
+        <w:t xml:space="preserve"> </w:t>
+      </w:r>
+      <w:r>
+        <w:t xml:space="preserve">· Articles →</w:t>
+      </w:r>
+      <w:r>
+        <w:t xml:space="preserve"> </w:t>
+      </w:r>
+      <w:r>
+        <w:rPr>
+          <w:rStyle w:val="VerbatimChar"/>
+        </w:rPr>
+        <w:t xml:space="preserve">/blogs/cocoon-blog</w:t>
       </w:r>
     </w:p>
     <w:p>
@@ -1651,7 +1672,7 @@
         <w:t xml:space="preserve"> </w:t>
       </w:r>
       <w:r>
-        <w:t xml:space="preserve">All Supplements · Balance · Androgen Balance · Liver Support · Find Your Formula</w:t>
+        <w:t xml:space="preserve">All Supplements · Balance · Androgen Balance · Liver Support · Quiz</w:t>
       </w:r>
     </w:p>
     <w:p>
@@ -1673,7 +1694,7 @@
         <w:t xml:space="preserve"> </w:t>
       </w:r>
       <w:r>
-        <w:t xml:space="preserve">Learn hub · Blog · Results</w:t>
+        <w:t xml:space="preserve">How Hormonal Acne Works · Articles · Reviews</w:t>
       </w:r>
     </w:p>
     <w:p>

</xml_diff>

<commit_message>
Blog handle to /blogs/learn, rename two 'treat' slugs; Find Your Formula as header button
Co-Authored-By: Claude Opus 5.5 <noreply@anthropic.com>
Claude-Session: https://claude.ai/code/session_01Ge5rEocBSg6juxs1ntKF6j
</commit_message>
<xml_diff>
--- a/website/copy/Cocoon-Website-Copy-draft1.docx
+++ b/website/copy/Cocoon-Website-Copy-draft1.docx
@@ -1411,7 +1411,7 @@
           <w:bCs/>
           <w:b/>
         </w:rPr>
-        <w:t xml:space="preserve">Quiz</w:t>
+        <w:t xml:space="preserve">Reviews</w:t>
       </w:r>
       <w:r>
         <w:t xml:space="preserve"> </w:t>
@@ -1426,121 +1426,118 @@
         <w:rPr>
           <w:rStyle w:val="VerbatimChar"/>
         </w:rPr>
+        <w:t xml:space="preserve">/pages/results</w:t>
+      </w:r>
+    </w:p>
+    <w:p>
+      <w:pPr>
+        <w:numPr>
+          <w:ilvl w:val="0"/>
+          <w:numId w:val="1005"/>
+        </w:numPr>
+        <w:pStyle w:val="Compact"/>
+      </w:pPr>
+      <w:r>
+        <w:rPr>
+          <w:bCs/>
+          <w:b/>
+        </w:rPr>
+        <w:t xml:space="preserve">Learn</w:t>
+      </w:r>
+      <w:r>
+        <w:t xml:space="preserve"> </w:t>
+      </w:r>
+      <w:r>
+        <w:t xml:space="preserve">▾: How Hormonal Acne Works →</w:t>
+      </w:r>
+      <w:r>
+        <w:t xml:space="preserve"> </w:t>
+      </w:r>
+      <w:r>
+        <w:rPr>
+          <w:rStyle w:val="VerbatimChar"/>
+        </w:rPr>
+        <w:t xml:space="preserve">/pages/learn</w:t>
+      </w:r>
+      <w:r>
+        <w:t xml:space="preserve"> </w:t>
+      </w:r>
+      <w:r>
+        <w:t xml:space="preserve">· Articles →</w:t>
+      </w:r>
+      <w:r>
+        <w:t xml:space="preserve"> </w:t>
+      </w:r>
+      <w:r>
+        <w:rPr>
+          <w:rStyle w:val="VerbatimChar"/>
+        </w:rPr>
+        <w:t xml:space="preserve">/blogs/learn</w:t>
+      </w:r>
+    </w:p>
+    <w:p>
+      <w:pPr>
+        <w:numPr>
+          <w:ilvl w:val="0"/>
+          <w:numId w:val="1005"/>
+        </w:numPr>
+        <w:pStyle w:val="Compact"/>
+      </w:pPr>
+      <w:r>
+        <w:rPr>
+          <w:bCs/>
+          <w:b/>
+        </w:rPr>
+        <w:t xml:space="preserve">About</w:t>
+      </w:r>
+      <w:r>
+        <w:t xml:space="preserve"> </w:t>
+      </w:r>
+      <w:r>
+        <w:t xml:space="preserve">→</w:t>
+      </w:r>
+      <w:r>
+        <w:t xml:space="preserve"> </w:t>
+      </w:r>
+      <w:r>
+        <w:rPr>
+          <w:rStyle w:val="VerbatimChar"/>
+        </w:rPr>
+        <w:t xml:space="preserve">/pages/about</w:t>
+      </w:r>
+    </w:p>
+    <w:p>
+      <w:pPr>
+        <w:numPr>
+          <w:ilvl w:val="0"/>
+          <w:numId w:val="1005"/>
+        </w:numPr>
+        <w:pStyle w:val="Compact"/>
+      </w:pPr>
+      <w:r>
+        <w:rPr>
+          <w:bCs/>
+          <w:b/>
+        </w:rPr>
+        <w:t xml:space="preserve">[Find Your Formula]</w:t>
+      </w:r>
+      <w:r>
+        <w:t xml:space="preserve"> </w:t>
+      </w:r>
+      <w:r>
+        <w:t xml:space="preserve">→</w:t>
+      </w:r>
+      <w:r>
+        <w:t xml:space="preserve"> </w:t>
+      </w:r>
+      <w:r>
+        <w:rPr>
+          <w:rStyle w:val="VerbatimChar"/>
+        </w:rPr>
         <w:t xml:space="preserve">/pages/quiz</w:t>
       </w:r>
       <w:r>
-        <w:t xml:space="preserve"> </w:t>
-      </w:r>
-      <w:r>
-        <w:t xml:space="preserve">(the page itself and its buttons say "Find your formula")</w:t>
-      </w:r>
-    </w:p>
-    <w:p>
-      <w:pPr>
-        <w:numPr>
-          <w:ilvl w:val="0"/>
-          <w:numId w:val="1005"/>
-        </w:numPr>
-        <w:pStyle w:val="Compact"/>
-      </w:pPr>
-      <w:r>
-        <w:rPr>
-          <w:bCs/>
-          <w:b/>
-        </w:rPr>
-        <w:t xml:space="preserve">Reviews</w:t>
-      </w:r>
-      <w:r>
-        <w:t xml:space="preserve"> </w:t>
-      </w:r>
-      <w:r>
-        <w:t xml:space="preserve">→</w:t>
-      </w:r>
-      <w:r>
-        <w:t xml:space="preserve"> </w:t>
-      </w:r>
-      <w:r>
-        <w:rPr>
-          <w:rStyle w:val="VerbatimChar"/>
-        </w:rPr>
-        <w:t xml:space="preserve">/pages/results</w:t>
-      </w:r>
-    </w:p>
-    <w:p>
-      <w:pPr>
-        <w:numPr>
-          <w:ilvl w:val="0"/>
-          <w:numId w:val="1005"/>
-        </w:numPr>
-        <w:pStyle w:val="Compact"/>
-      </w:pPr>
-      <w:r>
-        <w:rPr>
-          <w:bCs/>
-          <w:b/>
-        </w:rPr>
-        <w:t xml:space="preserve">Learn</w:t>
-      </w:r>
-      <w:r>
-        <w:t xml:space="preserve"> </w:t>
-      </w:r>
-      <w:r>
-        <w:t xml:space="preserve">▾: How Hormonal Acne Works →</w:t>
-      </w:r>
-      <w:r>
-        <w:t xml:space="preserve"> </w:t>
-      </w:r>
-      <w:r>
-        <w:rPr>
-          <w:rStyle w:val="VerbatimChar"/>
-        </w:rPr>
-        <w:t xml:space="preserve">/pages/learn</w:t>
-      </w:r>
-      <w:r>
-        <w:t xml:space="preserve"> </w:t>
-      </w:r>
-      <w:r>
-        <w:t xml:space="preserve">· Articles →</w:t>
-      </w:r>
-      <w:r>
-        <w:t xml:space="preserve"> </w:t>
-      </w:r>
-      <w:r>
-        <w:rPr>
-          <w:rStyle w:val="VerbatimChar"/>
-        </w:rPr>
-        <w:t xml:space="preserve">/blogs/cocoon-blog</w:t>
-      </w:r>
-    </w:p>
-    <w:p>
-      <w:pPr>
-        <w:numPr>
-          <w:ilvl w:val="0"/>
-          <w:numId w:val="1005"/>
-        </w:numPr>
-        <w:pStyle w:val="Compact"/>
-      </w:pPr>
-      <w:r>
-        <w:rPr>
-          <w:bCs/>
-          <w:b/>
-        </w:rPr>
-        <w:t xml:space="preserve">About</w:t>
-      </w:r>
-      <w:r>
-        <w:t xml:space="preserve"> </w:t>
-      </w:r>
-      <w:r>
-        <w:t xml:space="preserve">→</w:t>
-      </w:r>
-      <w:r>
-        <w:t xml:space="preserve"> </w:t>
-      </w:r>
-      <w:r>
-        <w:rPr>
-          <w:rStyle w:val="VerbatimChar"/>
-        </w:rPr>
-        <w:t xml:space="preserve">/pages/about</w:t>
+        <w:t xml:space="preserve">: styled as a button at the right of the header (on mobile, a button at the top of the menu drawer), so it reads as the main action rather than a fifth menu word</w:t>
       </w:r>
     </w:p>
     <w:p>
@@ -1672,7 +1669,7 @@
         <w:t xml:space="preserve"> </w:t>
       </w:r>
       <w:r>
-        <w:t xml:space="preserve">All Supplements · Balance · Androgen Balance · Liver Support · Quiz</w:t>
+        <w:t xml:space="preserve">All Supplements · Balance · Androgen Balance · Liver Support · Find Your Formula</w:t>
       </w:r>
     </w:p>
     <w:p>
@@ -12871,13 +12868,13 @@
         <w:rPr>
           <w:rStyle w:val="VerbatimChar"/>
         </w:rPr>
-        <w:t xml:space="preserve">/blogs/cocoon-blog/estrogen-dominance-in-women-symptoms-causes-and-natural-treatment</w:t>
-      </w:r>
-      <w:r>
-        <w:t xml:space="preserve"> </w:t>
-      </w:r>
-      <w:r>
-        <w:t xml:space="preserve">(keep the URL even though the slug says "treatment"; changing it would lose its history)</w:t>
+        <w:t xml:space="preserve">/blogs/learn/estrogen-dominance-acne</w:t>
+      </w:r>
+      <w:r>
+        <w:t xml:space="preserve"> </w:t>
+      </w:r>
+      <w:r>
+        <w:t xml:space="preserve">(renamed from estrogen-dominance-in-women-symptoms-causes-and-natural-treatment, with a 301)</w:t>
       </w:r>
     </w:p>
     <w:p>
@@ -13082,7 +13079,7 @@
         <w:rPr>
           <w:rStyle w:val="VerbatimChar"/>
         </w:rPr>
-        <w:t xml:space="preserve">/blogs/cocoon-blog/high-androgens-in-women</w:t>
+        <w:t xml:space="preserve">/blogs/learn/high-androgens-in-women</w:t>
       </w:r>
       <w:r>
         <w:t xml:space="preserve"> </w:t>
@@ -13779,7 +13776,7 @@
         <w:rPr>
           <w:rStyle w:val="VerbatimChar"/>
         </w:rPr>
-        <w:t xml:space="preserve">/blogs/cocoon-blog/liver-and-skin-health</w:t>
+        <w:t xml:space="preserve">/blogs/learn/liver-and-skin-health</w:t>
       </w:r>
       <w:r>
         <w:t xml:space="preserve"> </w:t>
@@ -14507,7 +14504,7 @@
               <w:rPr>
                 <w:rStyle w:val="VerbatimChar"/>
               </w:rPr>
-              <w:t xml:space="preserve">/blogs/cocoon-blog/best-teas-for-hormone-balance</w:t>
+              <w:t xml:space="preserve">/blogs/learn/best-teas-for-hormone-balance</w:t>
             </w:r>
             <w:r>
               <w:t xml:space="preserve"> </w:t>
@@ -14590,7 +14587,7 @@
               <w:rPr>
                 <w:rStyle w:val="VerbatimChar"/>
               </w:rPr>
-              <w:t xml:space="preserve">/blogs/cocoon-blog/can-coffee-make-hormonal-acne-worse</w:t>
+              <w:t xml:space="preserve">/blogs/learn/can-coffee-make-hormonal-acne-worse</w:t>
             </w:r>
           </w:p>
         </w:tc>
@@ -14673,7 +14670,7 @@
               <w:rPr>
                 <w:rStyle w:val="VerbatimChar"/>
               </w:rPr>
-              <w:t xml:space="preserve">/blogs/cocoon-blog/balancing-hormones-with-food</w:t>
+              <w:t xml:space="preserve">/blogs/learn/balancing-hormones-with-food</w:t>
             </w:r>
             <w:r>
               <w:t xml:space="preserve"> </w:t>
@@ -14688,7 +14685,7 @@
               <w:rPr>
                 <w:rStyle w:val="VerbatimChar"/>
               </w:rPr>
-              <w:t xml:space="preserve">/blogs/cocoon-blog/hormonal-acne-diet-building-hormone-balancing-meals</w:t>
+              <w:t xml:space="preserve">/blogs/learn/hormonal-acne-diet-building-hormone-balancing-meals</w:t>
             </w:r>
           </w:p>
         </w:tc>
@@ -14783,7 +14780,7 @@
               <w:rPr>
                 <w:rStyle w:val="VerbatimChar"/>
               </w:rPr>
-              <w:t xml:space="preserve">/blogs/cocoon-blog/hormonal-acne-pills-vs-supplements</w:t>
+              <w:t xml:space="preserve">/blogs/learn/hormonal-acne-pills-vs-supplements</w:t>
             </w:r>
             <w:r>
               <w:t xml:space="preserve">)</w:t>
@@ -14881,7 +14878,7 @@
               <w:rPr>
                 <w:rStyle w:val="VerbatimChar"/>
               </w:rPr>
-              <w:t xml:space="preserve">/blogs/cocoon-blog/dim-for-hormonal-acne</w:t>
+              <w:t xml:space="preserve">/blogs/learn/dim-for-hormonal-acne</w:t>
             </w:r>
             <w:r>
               <w:t xml:space="preserve">)</w:t>
@@ -14973,7 +14970,7 @@
               <w:rPr>
                 <w:rStyle w:val="VerbatimChar"/>
               </w:rPr>
-              <w:t xml:space="preserve">/blogs/cocoon-blog/calcium-d-glucarate-benefits</w:t>
+              <w:t xml:space="preserve">/blogs/learn/calcium-d-glucarate-benefits</w:t>
             </w:r>
             <w:r>
               <w:t xml:space="preserve">)</w:t>
@@ -15053,7 +15050,7 @@
               <w:rPr>
                 <w:rStyle w:val="VerbatimChar"/>
               </w:rPr>
-              <w:t xml:space="preserve">/blogs/cocoon-blog/can-hormonal-acne-be-caused-by-stress</w:t>
+              <w:t xml:space="preserve">/blogs/learn/can-hormonal-acne-be-caused-by-stress</w:t>
             </w:r>
             <w:r>
               <w:t xml:space="preserve"> </w:t>
@@ -15136,7 +15133,7 @@
               <w:rPr>
                 <w:rStyle w:val="VerbatimChar"/>
               </w:rPr>
-              <w:t xml:space="preserve">/blogs/cocoon-blog/hormone-safe-sunscreens</w:t>
+              <w:t xml:space="preserve">/blogs/learn/hormone-safe-sunscreens</w:t>
             </w:r>
             <w:r>
               <w:t xml:space="preserve"> </w:t>
@@ -15215,7 +15212,7 @@
               <w:rPr>
                 <w:rStyle w:val="VerbatimChar"/>
               </w:rPr>
-              <w:t xml:space="preserve">/blogs/cocoon-blog/how-to-know-what-type-of-hormonal-acne-you-have</w:t>
+              <w:t xml:space="preserve">/blogs/learn/how-to-know-what-type-of-hormonal-acne-you-have</w:t>
             </w:r>
             <w:r>
               <w:t xml:space="preserve"> </w:t>
@@ -15298,7 +15295,7 @@
               <w:rPr>
                 <w:rStyle w:val="VerbatimChar"/>
               </w:rPr>
-              <w:t xml:space="preserve">/blogs/cocoon-blog/how-to-treat-hormonal-acne-in-2026</w:t>
+              <w:t xml:space="preserve">/blogs/learn/how-to-clear-hormonal-acne</w:t>
             </w:r>
             <w:r>
               <w:t xml:space="preserve"> </w:t>
@@ -15352,7 +15349,7 @@
               <w:jc w:val="left"/>
             </w:pPr>
             <w:r>
-              <w:t xml:space="preserve">Retitles out "treat". Long term, move to an evergreen slug with a 301.</w:t>
+              <w:t xml:space="preserve">Renamed to an evergreen slug without "treat", with 301s from the 2025 and 2026 URLs.</w:t>
             </w:r>
           </w:p>
         </w:tc>
@@ -19578,7 +19575,7 @@
         <w:rPr>
           <w:rStyle w:val="VerbatimChar"/>
         </w:rPr>
-        <w:t xml:space="preserve">/blogs/cocoon-blog/high-androgens-in-women</w:t>
+        <w:t xml:space="preserve">/blogs/learn/high-androgens-in-women</w:t>
       </w:r>
       <w:r>
         <w:t xml:space="preserve"> </w:t>
@@ -19593,7 +19590,7 @@
         <w:rPr>
           <w:rStyle w:val="VerbatimChar"/>
         </w:rPr>
-        <w:t xml:space="preserve">/blogs/cocoon-blog/liver-and-skin-health</w:t>
+        <w:t xml:space="preserve">/blogs/learn/liver-and-skin-health</w:t>
       </w:r>
       <w:r>
         <w:t xml:space="preserve">.</w:t>

</xml_diff>

<commit_message>
Brand is 'Cocoon' only; Balance renamed Estrogen Balance; build dates; brief edits
Co-Authored-By: Claude Opus 5.5 <noreply@anthropic.com>
Claude-Session: https://claude.ai/code/session_01Ge5rEocBSg6juxs1ntKF6j
</commit_message>
<xml_diff>
--- a/website/copy/Cocoon-Website-Copy-draft1.docx
+++ b/website/copy/Cocoon-Website-Copy-draft1.docx
@@ -7,7 +7,7 @@
         <w:pStyle w:val="Title"/>
       </w:pPr>
       <w:r>
-        <w:t xml:space="preserve">Cocoon Supplements: Website Copy (draft 1)</w:t>
+        <w:t xml:space="preserve">Cocoon: Website Copy (draft 1)</w:t>
       </w:r>
     </w:p>
     <w:bookmarkStart w:id="127" w:name="cocoonsupplementscom-site-copy"/>
@@ -104,6 +104,62 @@
       </w:r>
       <w:r>
         <w:t xml:space="preserve">nothing here is live. Every change to Shopify, Typeform or Klaviyo still needs your sign-off.</w:t>
+      </w:r>
+    </w:p>
+    <w:p>
+      <w:pPr>
+        <w:pStyle w:val="BodyText"/>
+      </w:pPr>
+      <w:r>
+        <w:rPr>
+          <w:bCs/>
+          <w:b/>
+        </w:rPr>
+        <w:t xml:space="preserve">Revision note (24 Oct 2026):</w:t>
+      </w:r>
+      <w:r>
+        <w:t xml:space="preserve"> </w:t>
+      </w:r>
+      <w:r>
+        <w:t xml:space="preserve">this draft predates two decisions, which the next revision applies once Logan's keyword input is in. Balance is now</w:t>
+      </w:r>
+      <w:r>
+        <w:t xml:space="preserve"> </w:t>
+      </w:r>
+      <w:r>
+        <w:rPr>
+          <w:bCs/>
+          <w:b/>
+        </w:rPr>
+        <w:t xml:space="preserve">Estrogen Balance</w:t>
+      </w:r>
+      <w:r>
+        <w:t xml:space="preserve"> </w:t>
+      </w:r>
+      <w:r>
+        <w:t xml:space="preserve">(</w:t>
+      </w:r>
+      <w:r>
+        <w:rPr>
+          <w:rStyle w:val="VerbatimChar"/>
+        </w:rPr>
+        <w:t xml:space="preserve">/products/estrogen-balance</w:t>
+      </w:r>
+      <w:r>
+        <w:t xml:space="preserve">), and the brand is just</w:t>
+      </w:r>
+      <w:r>
+        <w:t xml:space="preserve"> </w:t>
+      </w:r>
+      <w:r>
+        <w:rPr>
+          <w:bCs/>
+          <w:b/>
+        </w:rPr>
+        <w:t xml:space="preserve">Cocoon</w:t>
+      </w:r>
+      <w:r>
+        <w:t xml:space="preserve">: no "Cocoon Supplements" and no "formerly Cocoon Skincare" anywhere on the site. The three new-article rows in the blog section are out of scope for now.</w:t>
       </w:r>
     </w:p>
     <w:p>

</xml_diff>

<commit_message>
Shop All collection handle: supplements
Co-Authored-By: Claude Opus 5.5 <noreply@anthropic.com>
Claude-Session: https://claude.ai/code/session_01Ge5rEocBSg6juxs1ntKF6j
</commit_message>
<xml_diff>
--- a/website/copy/Cocoon-Website-Copy-draft1.docx
+++ b/website/copy/Cocoon-Website-Copy-draft1.docx
@@ -733,7 +733,7 @@
         <w:rPr>
           <w:rStyle w:val="VerbatimChar"/>
         </w:rPr>
-        <w:t xml:space="preserve">/collections/skin-supplements</w:t>
+        <w:t xml:space="preserve">/collections/supplements</w:t>
       </w:r>
     </w:p>
     <w:p>
@@ -2365,7 +2365,7 @@
         <w:rPr>
           <w:rStyle w:val="VerbatimChar"/>
         </w:rPr>
-        <w:t xml:space="preserve">/collections/skin-supplements</w:t>
+        <w:t xml:space="preserve">/collections/supplements</w:t>
       </w:r>
     </w:p>
     <w:bookmarkEnd w:id="28"/>
@@ -3802,7 +3802,7 @@
         <w:rPr>
           <w:rStyle w:val="VerbatimChar"/>
         </w:rPr>
-        <w:t xml:space="preserve">/collections/skin-supplements</w:t>
+        <w:t xml:space="preserve">/collections/supplements</w:t>
       </w:r>
       <w:r>
         <w:t xml:space="preserve"> </w:t>
@@ -5414,7 +5414,7 @@
         <w:rPr>
           <w:rStyle w:val="VerbatimChar"/>
         </w:rPr>
-        <w:t xml:space="preserve">/collections/skin-supplements</w:t>
+        <w:t xml:space="preserve">/collections/supplements</w:t>
       </w:r>
       <w:r>
         <w:t xml:space="preserve">)</w:t>
@@ -11488,7 +11488,7 @@
         <w:rPr>
           <w:rStyle w:val="VerbatimChar"/>
         </w:rPr>
-        <w:t xml:space="preserve">/collections/skin-supplements</w:t>
+        <w:t xml:space="preserve">/collections/supplements</w:t>
       </w:r>
     </w:p>
     <w:p>

</xml_diff>

<commit_message>
Deep-dive URLs as [root cause]-and-acne; brief edits; timeline from Oct 29
Co-Authored-By: Claude Opus 5.5 <noreply@anthropic.com>
Claude-Session: https://claude.ai/code/session_01Ge5rEocBSg6juxs1ntKF6j
</commit_message>
<xml_diff>
--- a/website/copy/Cocoon-Website-Copy-draft1.docx
+++ b/website/copy/Cocoon-Website-Copy-draft1.docx
@@ -12924,7 +12924,7 @@
         <w:rPr>
           <w:rStyle w:val="VerbatimChar"/>
         </w:rPr>
-        <w:t xml:space="preserve">/blogs/learn/estrogen-dominance-acne</w:t>
+        <w:t xml:space="preserve">/blogs/learn/estrogen-dominance-and-acne</w:t>
       </w:r>
       <w:r>
         <w:t xml:space="preserve"> </w:t>
@@ -13135,7 +13135,7 @@
         <w:rPr>
           <w:rStyle w:val="VerbatimChar"/>
         </w:rPr>
-        <w:t xml:space="preserve">/blogs/learn/high-androgens-in-women</w:t>
+        <w:t xml:space="preserve">/blogs/learn/high-androgens-and-acne</w:t>
       </w:r>
       <w:r>
         <w:t xml:space="preserve"> </w:t>
@@ -13832,7 +13832,7 @@
         <w:rPr>
           <w:rStyle w:val="VerbatimChar"/>
         </w:rPr>
-        <w:t xml:space="preserve">/blogs/learn/liver-and-skin-health</w:t>
+        <w:t xml:space="preserve">/blogs/learn/liver-health-and-acne</w:t>
       </w:r>
       <w:r>
         <w:t xml:space="preserve"> </w:t>
@@ -19631,7 +19631,7 @@
         <w:rPr>
           <w:rStyle w:val="VerbatimChar"/>
         </w:rPr>
-        <w:t xml:space="preserve">/blogs/learn/high-androgens-in-women</w:t>
+        <w:t xml:space="preserve">/blogs/learn/high-androgens-and-acne</w:t>
       </w:r>
       <w:r>
         <w:t xml:space="preserve"> </w:t>
@@ -19646,7 +19646,7 @@
         <w:rPr>
           <w:rStyle w:val="VerbatimChar"/>
         </w:rPr>
-        <w:t xml:space="preserve">/blogs/learn/liver-and-skin-health</w:t>
+        <w:t xml:space="preserve">/blogs/learn/liver-health-and-acne</w:t>
       </w:r>
       <w:r>
         <w:t xml:space="preserve">.</w:t>

</xml_diff>